<commit_message>
Replace Winamp with custom built-in audio player
</commit_message>
<xml_diff>
--- a/Important attachments/Инструкция КХСМ.docx
+++ b/Important attachments/Инструкция КХСМ.docx
@@ -4035,416 +4035,130 @@
         <w:t>. Для большего быстродействия расположите ПО на физическом носителе в самом устройстве, а не на съёмном носителе или устройстве в сети.</w:t>
       </w:r>
       <w:r>
-        <w:t xml:space="preserve"> На </w:t>
-      </w:r>
-      <w:r>
-        <w:t>ПК-1</w:t>
-      </w:r>
-      <w:r>
-        <w:t xml:space="preserve"> в папке с программой откройте папку </w:t>
-      </w:r>
-      <w:r>
-        <w:t>“</w:t>
-      </w:r>
-      <w:r>
-        <w:rPr>
-          <w:lang w:val="en-US"/>
-        </w:rPr>
-        <w:t>Installers</w:t>
-      </w:r>
-      <w:r>
-        <w:t>”</w:t>
-      </w:r>
-      <w:r>
-        <w:t>,</w:t>
-      </w:r>
-      <w:r>
+        <w:t xml:space="preserve"> Запустите из папки с программой файл</w:t>
+      </w:r>
+      <w:r>
+        <w:t xml:space="preserve"> “</w:t>
+      </w:r>
+      <w:r>
+        <w:rPr>
+          <w:b/>
+          <w:lang w:val="en-US"/>
+        </w:rPr>
+        <w:t>WWTBAM</w:t>
+      </w:r>
+      <w:r>
+        <w:rPr>
+          <w:b/>
+        </w:rPr>
         <w:t xml:space="preserve"> </w:t>
       </w:r>
       <w:r>
-        <w:t>запустите</w:t>
-      </w:r>
-      <w:r>
-        <w:t xml:space="preserve"> в ней файл </w:t>
-      </w:r>
-      <w:r>
-        <w:t>“</w:t>
-      </w:r>
-      <w:r>
-        <w:rPr>
-          <w:lang w:val="en-US"/>
-        </w:rPr>
-        <w:t>Winamp</w:t>
-      </w:r>
-      <w:r>
-        <w:t xml:space="preserve"> 5.666 </w:t>
-      </w:r>
-      <w:r>
-        <w:rPr>
-          <w:lang w:val="en-US"/>
-        </w:rPr>
-        <w:t>Full</w:t>
-      </w:r>
-      <w:r>
+        <w:rPr>
+          <w:b/>
+          <w:lang w:val="en-US"/>
+        </w:rPr>
+        <w:t>Control</w:t>
+      </w:r>
+      <w:r>
+        <w:rPr>
+          <w:b/>
+        </w:rPr>
         <w:t xml:space="preserve"> </w:t>
       </w:r>
       <w:r>
         <w:rPr>
-          <w:lang w:val="en-US"/>
-        </w:rPr>
-        <w:t>Version</w:t>
+          <w:b/>
+          <w:lang w:val="en-US"/>
+        </w:rPr>
+        <w:t>Program</w:t>
+      </w:r>
+      <w:r>
+        <w:rPr>
+          <w:b/>
+        </w:rPr>
+        <w:t>.</w:t>
+      </w:r>
+      <w:r>
+        <w:rPr>
+          <w:b/>
+          <w:lang w:val="en-US"/>
+        </w:rPr>
+        <w:t>exe</w:t>
+      </w:r>
+      <w:r>
+        <w:t xml:space="preserve">” </w:t>
+      </w:r>
+      <w:r>
+        <w:t>на</w:t>
       </w:r>
       <w:r>
         <w:t xml:space="preserve"> </w:t>
       </w:r>
       <w:r>
-        <w:rPr>
-          <w:lang w:val="en-US"/>
-        </w:rPr>
-        <w:t>Install</w:t>
+        <w:t>обоих</w:t>
+      </w:r>
+      <w:r>
+        <w:t xml:space="preserve"> </w:t>
+      </w:r>
+      <w:r>
+        <w:t>компьютерах</w:t>
       </w:r>
       <w:r>
         <w:t>.</w:t>
       </w:r>
       <w:r>
-        <w:rPr>
-          <w:lang w:val="en-US"/>
-        </w:rPr>
-        <w:t>exe</w:t>
-      </w:r>
-      <w:r>
-        <w:t>”</w:t>
-      </w:r>
-      <w:r>
-        <w:t xml:space="preserve"> и установите проигрыватель </w:t>
-      </w:r>
-      <w:r>
-        <w:rPr>
-          <w:b/>
-          <w:lang w:val="en-US"/>
-        </w:rPr>
-        <w:t>Winamp</w:t>
-      </w:r>
-      <w:r>
-        <w:rPr>
-          <w:b/>
-        </w:rPr>
+        <w:t xml:space="preserve"> Если </w:t>
+      </w:r>
+      <w:r>
+        <w:t>не удалось</w:t>
+      </w:r>
+      <w:r>
+        <w:t xml:space="preserve">, </w:t>
+      </w:r>
+      <w:r>
+        <w:t xml:space="preserve">установите </w:t>
+      </w:r>
+      <w:r>
+        <w:t>“.</w:t>
+      </w:r>
+      <w:r>
+        <w:rPr>
+          <w:lang w:val="en-US"/>
+        </w:rPr>
+        <w:t>NET</w:t>
+      </w:r>
+      <w:r>
+        <w:t xml:space="preserve"> </w:t>
+      </w:r>
+      <w:r>
+        <w:rPr>
+          <w:lang w:val="en-US"/>
+        </w:rPr>
+        <w:t>Framework</w:t>
+      </w:r>
+      <w:r>
+        <w:t xml:space="preserve"> 4.8</w:t>
+      </w:r>
+      <w:r>
         <w:t>®</w:t>
       </w:r>
       <w:r>
+        <w:t>” (</w:t>
+      </w:r>
+      <w:r>
+        <w:rPr>
+          <w:lang w:val="en-US"/>
+        </w:rPr>
+        <w:t>Microsoft</w:t>
+      </w:r>
+      <w:r>
+        <w:t>©</w:t>
+      </w:r>
+      <w:r>
         <w:t xml:space="preserve"> </w:t>
       </w:r>
       <w:r>
-        <w:t xml:space="preserve">строго в указанную </w:t>
-      </w:r>
-      <w:r>
-        <w:t>директорию</w:t>
-      </w:r>
-      <w:r>
-        <w:t>:</w:t>
-      </w:r>
-      <w:r>
-        <w:t xml:space="preserve"> </w:t>
-      </w:r>
-      <w:r>
-        <w:t>“</w:t>
-      </w:r>
-      <w:r>
-        <w:rPr>
-          <w:lang w:val="en-US"/>
-        </w:rPr>
-        <w:t>C</w:t>
-      </w:r>
-      <w:r>
-        <w:t>:\</w:t>
-      </w:r>
-      <w:r>
-        <w:rPr>
-          <w:lang w:val="en-US"/>
-        </w:rPr>
-        <w:t>Program</w:t>
-      </w:r>
-      <w:r>
-        <w:t xml:space="preserve"> </w:t>
-      </w:r>
-      <w:r>
-        <w:rPr>
-          <w:lang w:val="en-US"/>
-        </w:rPr>
-        <w:t>Files</w:t>
-      </w:r>
-      <w:r>
-        <w:t>\</w:t>
-      </w:r>
-      <w:r>
-        <w:rPr>
-          <w:lang w:val="en-US"/>
-        </w:rPr>
-        <w:t>Winamp</w:t>
-      </w:r>
-      <w:r>
-        <w:t xml:space="preserve">” </w:t>
-      </w:r>
-      <w:r>
-        <w:t xml:space="preserve">(будьте внимательны, на </w:t>
-      </w:r>
-      <w:r>
-        <w:t>64</w:t>
-      </w:r>
-      <w:r>
-        <w:t xml:space="preserve">-разрядных системах по умолчанию путь установки </w:t>
-      </w:r>
-      <w:r>
-        <w:t>“</w:t>
-      </w:r>
-      <w:r>
-        <w:rPr>
-          <w:lang w:val="en-US"/>
-        </w:rPr>
-        <w:t>C</w:t>
-      </w:r>
-      <w:r>
-        <w:t>:\</w:t>
-      </w:r>
-      <w:r>
-        <w:rPr>
-          <w:lang w:val="en-US"/>
-        </w:rPr>
-        <w:t>Program</w:t>
-      </w:r>
-      <w:r>
-        <w:t xml:space="preserve"> </w:t>
-      </w:r>
-      <w:r>
-        <w:rPr>
-          <w:lang w:val="en-US"/>
-        </w:rPr>
-        <w:t>Files</w:t>
-      </w:r>
-      <w:r>
-        <w:t xml:space="preserve"> </w:t>
-      </w:r>
-      <w:r>
-        <w:t>(</w:t>
-      </w:r>
-      <w:r>
-        <w:rPr>
-          <w:lang w:val="en-US"/>
-        </w:rPr>
-        <w:t>x</w:t>
-      </w:r>
-      <w:r>
-        <w:t>86)\</w:t>
-      </w:r>
-      <w:r>
-        <w:rPr>
-          <w:lang w:val="en-US"/>
-        </w:rPr>
-        <w:t>Winamp</w:t>
-      </w:r>
-      <w:r>
-        <w:t>”</w:t>
-      </w:r>
-      <w:r>
-        <w:t xml:space="preserve">, уберите из него </w:t>
-      </w:r>
-      <w:r>
-        <w:t>“(</w:t>
-      </w:r>
-      <w:r>
-        <w:rPr>
-          <w:lang w:val="en-US"/>
-        </w:rPr>
-        <w:t>x</w:t>
-      </w:r>
-      <w:r>
-        <w:t>86)”</w:t>
-      </w:r>
-      <w:r>
-        <w:t>). После установки откройте проигрыватель. После чего запустите из папки с программой файл</w:t>
-      </w:r>
-      <w:r>
-        <w:t xml:space="preserve"> “</w:t>
-      </w:r>
-      <w:r>
-        <w:rPr>
-          <w:b/>
-          <w:lang w:val="en-US"/>
-        </w:rPr>
-        <w:t>WWTBAM</w:t>
-      </w:r>
-      <w:r>
-        <w:rPr>
-          <w:b/>
-        </w:rPr>
-        <w:t xml:space="preserve"> </w:t>
-      </w:r>
-      <w:r>
-        <w:rPr>
-          <w:b/>
-          <w:lang w:val="en-US"/>
-        </w:rPr>
-        <w:t>Control</w:t>
-      </w:r>
-      <w:r>
-        <w:rPr>
-          <w:b/>
-        </w:rPr>
-        <w:t xml:space="preserve"> </w:t>
-      </w:r>
-      <w:r>
-        <w:rPr>
-          <w:b/>
-          <w:lang w:val="en-US"/>
-        </w:rPr>
-        <w:t>Program</w:t>
-      </w:r>
-      <w:r>
-        <w:rPr>
-          <w:b/>
-        </w:rPr>
-        <w:t>.</w:t>
-      </w:r>
-      <w:r>
-        <w:rPr>
-          <w:b/>
-          <w:lang w:val="en-US"/>
-        </w:rPr>
-        <w:t>exe</w:t>
-      </w:r>
-      <w:r>
-        <w:t xml:space="preserve">” </w:t>
-      </w:r>
-      <w:r>
-        <w:t>на</w:t>
-      </w:r>
-      <w:r>
-        <w:t xml:space="preserve"> </w:t>
-      </w:r>
-      <w:r>
-        <w:t>обоих</w:t>
-      </w:r>
-      <w:r>
-        <w:t xml:space="preserve"> </w:t>
-      </w:r>
-      <w:r>
-        <w:t>компьютерах</w:t>
-      </w:r>
-      <w:r>
-        <w:t>.</w:t>
-      </w:r>
-      <w:r>
-        <w:t xml:space="preserve"> Если </w:t>
-      </w:r>
-      <w:r>
-        <w:t>не удалось</w:t>
-      </w:r>
-      <w:r>
-        <w:t xml:space="preserve">, </w:t>
-      </w:r>
-      <w:r>
-        <w:t>запуст</w:t>
-      </w:r>
-      <w:r>
-        <w:t xml:space="preserve">ите из папки </w:t>
-      </w:r>
-      <w:r>
-        <w:t>“</w:t>
-      </w:r>
-      <w:r>
-        <w:rPr>
-          <w:lang w:val="en-US"/>
-        </w:rPr>
-        <w:t>Installers</w:t>
-      </w:r>
-      <w:r>
-        <w:t>”</w:t>
-      </w:r>
-      <w:r>
-        <w:t xml:space="preserve"> файл </w:t>
-      </w:r>
-      <w:r>
-        <w:t>“</w:t>
-      </w:r>
-      <w:r>
-        <w:rPr>
-          <w:lang w:val="en-US"/>
-        </w:rPr>
-        <w:t>NET</w:t>
-      </w:r>
-      <w:r>
-        <w:t xml:space="preserve"> </w:t>
-      </w:r>
-      <w:r>
-        <w:rPr>
-          <w:lang w:val="en-US"/>
-        </w:rPr>
-        <w:t>Framework</w:t>
-      </w:r>
-      <w:r>
-        <w:t xml:space="preserve"> 4 </w:t>
-      </w:r>
-      <w:r>
-        <w:rPr>
-          <w:lang w:val="en-US"/>
-        </w:rPr>
-        <w:t>Installer</w:t>
-      </w:r>
-      <w:r>
-        <w:t>.</w:t>
-      </w:r>
-      <w:r>
-        <w:rPr>
-          <w:lang w:val="en-US"/>
-        </w:rPr>
-        <w:t>exe</w:t>
-      </w:r>
-      <w:r>
-        <w:t>”</w:t>
-      </w:r>
-      <w:r>
-        <w:t xml:space="preserve">, тем самым установив </w:t>
-      </w:r>
-      <w:r>
-        <w:t>“.</w:t>
-      </w:r>
-      <w:r>
-        <w:rPr>
-          <w:lang w:val="en-US"/>
-        </w:rPr>
-        <w:t>NET</w:t>
-      </w:r>
-      <w:r>
-        <w:t xml:space="preserve"> </w:t>
-      </w:r>
-      <w:r>
-        <w:rPr>
-          <w:lang w:val="en-US"/>
-        </w:rPr>
-        <w:t>Framework</w:t>
-      </w:r>
-      <w:r>
-        <w:t xml:space="preserve"> 4</w:t>
-      </w:r>
-      <w:r>
-        <w:t>®</w:t>
-      </w:r>
-      <w:r>
-        <w:t>” (</w:t>
-      </w:r>
-      <w:r>
-        <w:rPr>
-          <w:lang w:val="en-US"/>
-        </w:rPr>
-        <w:t>Microsoft</w:t>
-      </w:r>
-      <w:r>
-        <w:t>©</w:t>
-      </w:r>
-      <w:r>
-        <w:t xml:space="preserve"> </w:t>
-      </w:r>
-      <w:r>
         <w:rPr>
           <w:lang w:val="en-US"/>
         </w:rPr>
@@ -4454,7 +4168,7 @@
         <w:t>.)</w:t>
       </w:r>
       <w:r>
-        <w:t xml:space="preserve">. После чего попробуйте запустить программу снова. </w:t>
+        <w:t xml:space="preserve"> и попробуйте запустить программу снова. </w:t>
       </w:r>
       <w:r>
         <w:rPr>

</xml_diff>

<commit_message>
Replace Winamp with custom built-in audio player (#2)
</commit_message>
<xml_diff>
--- a/Important attachments/Инструкция КХСМ.docx
+++ b/Important attachments/Инструкция КХСМ.docx
@@ -4035,416 +4035,130 @@
         <w:t>. Для большего быстродействия расположите ПО на физическом носителе в самом устройстве, а не на съёмном носителе или устройстве в сети.</w:t>
       </w:r>
       <w:r>
-        <w:t xml:space="preserve"> На </w:t>
-      </w:r>
-      <w:r>
-        <w:t>ПК-1</w:t>
-      </w:r>
-      <w:r>
-        <w:t xml:space="preserve"> в папке с программой откройте папку </w:t>
-      </w:r>
-      <w:r>
-        <w:t>“</w:t>
-      </w:r>
-      <w:r>
-        <w:rPr>
-          <w:lang w:val="en-US"/>
-        </w:rPr>
-        <w:t>Installers</w:t>
-      </w:r>
-      <w:r>
-        <w:t>”</w:t>
-      </w:r>
-      <w:r>
-        <w:t>,</w:t>
-      </w:r>
-      <w:r>
+        <w:t xml:space="preserve"> Запустите из папки с программой файл</w:t>
+      </w:r>
+      <w:r>
+        <w:t xml:space="preserve"> “</w:t>
+      </w:r>
+      <w:r>
+        <w:rPr>
+          <w:b/>
+          <w:lang w:val="en-US"/>
+        </w:rPr>
+        <w:t>WWTBAM</w:t>
+      </w:r>
+      <w:r>
+        <w:rPr>
+          <w:b/>
+        </w:rPr>
         <w:t xml:space="preserve"> </w:t>
       </w:r>
       <w:r>
-        <w:t>запустите</w:t>
-      </w:r>
-      <w:r>
-        <w:t xml:space="preserve"> в ней файл </w:t>
-      </w:r>
-      <w:r>
-        <w:t>“</w:t>
-      </w:r>
-      <w:r>
-        <w:rPr>
-          <w:lang w:val="en-US"/>
-        </w:rPr>
-        <w:t>Winamp</w:t>
-      </w:r>
-      <w:r>
-        <w:t xml:space="preserve"> 5.666 </w:t>
-      </w:r>
-      <w:r>
-        <w:rPr>
-          <w:lang w:val="en-US"/>
-        </w:rPr>
-        <w:t>Full</w:t>
-      </w:r>
-      <w:r>
+        <w:rPr>
+          <w:b/>
+          <w:lang w:val="en-US"/>
+        </w:rPr>
+        <w:t>Control</w:t>
+      </w:r>
+      <w:r>
+        <w:rPr>
+          <w:b/>
+        </w:rPr>
         <w:t xml:space="preserve"> </w:t>
       </w:r>
       <w:r>
         <w:rPr>
-          <w:lang w:val="en-US"/>
-        </w:rPr>
-        <w:t>Version</w:t>
+          <w:b/>
+          <w:lang w:val="en-US"/>
+        </w:rPr>
+        <w:t>Program</w:t>
+      </w:r>
+      <w:r>
+        <w:rPr>
+          <w:b/>
+        </w:rPr>
+        <w:t>.</w:t>
+      </w:r>
+      <w:r>
+        <w:rPr>
+          <w:b/>
+          <w:lang w:val="en-US"/>
+        </w:rPr>
+        <w:t>exe</w:t>
+      </w:r>
+      <w:r>
+        <w:t xml:space="preserve">” </w:t>
+      </w:r>
+      <w:r>
+        <w:t>на</w:t>
       </w:r>
       <w:r>
         <w:t xml:space="preserve"> </w:t>
       </w:r>
       <w:r>
-        <w:rPr>
-          <w:lang w:val="en-US"/>
-        </w:rPr>
-        <w:t>Install</w:t>
+        <w:t>обоих</w:t>
+      </w:r>
+      <w:r>
+        <w:t xml:space="preserve"> </w:t>
+      </w:r>
+      <w:r>
+        <w:t>компьютерах</w:t>
       </w:r>
       <w:r>
         <w:t>.</w:t>
       </w:r>
       <w:r>
-        <w:rPr>
-          <w:lang w:val="en-US"/>
-        </w:rPr>
-        <w:t>exe</w:t>
-      </w:r>
-      <w:r>
-        <w:t>”</w:t>
-      </w:r>
-      <w:r>
-        <w:t xml:space="preserve"> и установите проигрыватель </w:t>
-      </w:r>
-      <w:r>
-        <w:rPr>
-          <w:b/>
-          <w:lang w:val="en-US"/>
-        </w:rPr>
-        <w:t>Winamp</w:t>
-      </w:r>
-      <w:r>
-        <w:rPr>
-          <w:b/>
-        </w:rPr>
+        <w:t xml:space="preserve"> Если </w:t>
+      </w:r>
+      <w:r>
+        <w:t>не удалось</w:t>
+      </w:r>
+      <w:r>
+        <w:t xml:space="preserve">, </w:t>
+      </w:r>
+      <w:r>
+        <w:t xml:space="preserve">установите </w:t>
+      </w:r>
+      <w:r>
+        <w:t>“.</w:t>
+      </w:r>
+      <w:r>
+        <w:rPr>
+          <w:lang w:val="en-US"/>
+        </w:rPr>
+        <w:t>NET</w:t>
+      </w:r>
+      <w:r>
+        <w:t xml:space="preserve"> </w:t>
+      </w:r>
+      <w:r>
+        <w:rPr>
+          <w:lang w:val="en-US"/>
+        </w:rPr>
+        <w:t>Framework</w:t>
+      </w:r>
+      <w:r>
+        <w:t xml:space="preserve"> 4.8</w:t>
+      </w:r>
+      <w:r>
         <w:t>®</w:t>
       </w:r>
       <w:r>
+        <w:t>” (</w:t>
+      </w:r>
+      <w:r>
+        <w:rPr>
+          <w:lang w:val="en-US"/>
+        </w:rPr>
+        <w:t>Microsoft</w:t>
+      </w:r>
+      <w:r>
+        <w:t>©</w:t>
+      </w:r>
+      <w:r>
         <w:t xml:space="preserve"> </w:t>
       </w:r>
       <w:r>
-        <w:t xml:space="preserve">строго в указанную </w:t>
-      </w:r>
-      <w:r>
-        <w:t>директорию</w:t>
-      </w:r>
-      <w:r>
-        <w:t>:</w:t>
-      </w:r>
-      <w:r>
-        <w:t xml:space="preserve"> </w:t>
-      </w:r>
-      <w:r>
-        <w:t>“</w:t>
-      </w:r>
-      <w:r>
-        <w:rPr>
-          <w:lang w:val="en-US"/>
-        </w:rPr>
-        <w:t>C</w:t>
-      </w:r>
-      <w:r>
-        <w:t>:\</w:t>
-      </w:r>
-      <w:r>
-        <w:rPr>
-          <w:lang w:val="en-US"/>
-        </w:rPr>
-        <w:t>Program</w:t>
-      </w:r>
-      <w:r>
-        <w:t xml:space="preserve"> </w:t>
-      </w:r>
-      <w:r>
-        <w:rPr>
-          <w:lang w:val="en-US"/>
-        </w:rPr>
-        <w:t>Files</w:t>
-      </w:r>
-      <w:r>
-        <w:t>\</w:t>
-      </w:r>
-      <w:r>
-        <w:rPr>
-          <w:lang w:val="en-US"/>
-        </w:rPr>
-        <w:t>Winamp</w:t>
-      </w:r>
-      <w:r>
-        <w:t xml:space="preserve">” </w:t>
-      </w:r>
-      <w:r>
-        <w:t xml:space="preserve">(будьте внимательны, на </w:t>
-      </w:r>
-      <w:r>
-        <w:t>64</w:t>
-      </w:r>
-      <w:r>
-        <w:t xml:space="preserve">-разрядных системах по умолчанию путь установки </w:t>
-      </w:r>
-      <w:r>
-        <w:t>“</w:t>
-      </w:r>
-      <w:r>
-        <w:rPr>
-          <w:lang w:val="en-US"/>
-        </w:rPr>
-        <w:t>C</w:t>
-      </w:r>
-      <w:r>
-        <w:t>:\</w:t>
-      </w:r>
-      <w:r>
-        <w:rPr>
-          <w:lang w:val="en-US"/>
-        </w:rPr>
-        <w:t>Program</w:t>
-      </w:r>
-      <w:r>
-        <w:t xml:space="preserve"> </w:t>
-      </w:r>
-      <w:r>
-        <w:rPr>
-          <w:lang w:val="en-US"/>
-        </w:rPr>
-        <w:t>Files</w:t>
-      </w:r>
-      <w:r>
-        <w:t xml:space="preserve"> </w:t>
-      </w:r>
-      <w:r>
-        <w:t>(</w:t>
-      </w:r>
-      <w:r>
-        <w:rPr>
-          <w:lang w:val="en-US"/>
-        </w:rPr>
-        <w:t>x</w:t>
-      </w:r>
-      <w:r>
-        <w:t>86)\</w:t>
-      </w:r>
-      <w:r>
-        <w:rPr>
-          <w:lang w:val="en-US"/>
-        </w:rPr>
-        <w:t>Winamp</w:t>
-      </w:r>
-      <w:r>
-        <w:t>”</w:t>
-      </w:r>
-      <w:r>
-        <w:t xml:space="preserve">, уберите из него </w:t>
-      </w:r>
-      <w:r>
-        <w:t>“(</w:t>
-      </w:r>
-      <w:r>
-        <w:rPr>
-          <w:lang w:val="en-US"/>
-        </w:rPr>
-        <w:t>x</w:t>
-      </w:r>
-      <w:r>
-        <w:t>86)”</w:t>
-      </w:r>
-      <w:r>
-        <w:t>). После установки откройте проигрыватель. После чего запустите из папки с программой файл</w:t>
-      </w:r>
-      <w:r>
-        <w:t xml:space="preserve"> “</w:t>
-      </w:r>
-      <w:r>
-        <w:rPr>
-          <w:b/>
-          <w:lang w:val="en-US"/>
-        </w:rPr>
-        <w:t>WWTBAM</w:t>
-      </w:r>
-      <w:r>
-        <w:rPr>
-          <w:b/>
-        </w:rPr>
-        <w:t xml:space="preserve"> </w:t>
-      </w:r>
-      <w:r>
-        <w:rPr>
-          <w:b/>
-          <w:lang w:val="en-US"/>
-        </w:rPr>
-        <w:t>Control</w:t>
-      </w:r>
-      <w:r>
-        <w:rPr>
-          <w:b/>
-        </w:rPr>
-        <w:t xml:space="preserve"> </w:t>
-      </w:r>
-      <w:r>
-        <w:rPr>
-          <w:b/>
-          <w:lang w:val="en-US"/>
-        </w:rPr>
-        <w:t>Program</w:t>
-      </w:r>
-      <w:r>
-        <w:rPr>
-          <w:b/>
-        </w:rPr>
-        <w:t>.</w:t>
-      </w:r>
-      <w:r>
-        <w:rPr>
-          <w:b/>
-          <w:lang w:val="en-US"/>
-        </w:rPr>
-        <w:t>exe</w:t>
-      </w:r>
-      <w:r>
-        <w:t xml:space="preserve">” </w:t>
-      </w:r>
-      <w:r>
-        <w:t>на</w:t>
-      </w:r>
-      <w:r>
-        <w:t xml:space="preserve"> </w:t>
-      </w:r>
-      <w:r>
-        <w:t>обоих</w:t>
-      </w:r>
-      <w:r>
-        <w:t xml:space="preserve"> </w:t>
-      </w:r>
-      <w:r>
-        <w:t>компьютерах</w:t>
-      </w:r>
-      <w:r>
-        <w:t>.</w:t>
-      </w:r>
-      <w:r>
-        <w:t xml:space="preserve"> Если </w:t>
-      </w:r>
-      <w:r>
-        <w:t>не удалось</w:t>
-      </w:r>
-      <w:r>
-        <w:t xml:space="preserve">, </w:t>
-      </w:r>
-      <w:r>
-        <w:t>запуст</w:t>
-      </w:r>
-      <w:r>
-        <w:t xml:space="preserve">ите из папки </w:t>
-      </w:r>
-      <w:r>
-        <w:t>“</w:t>
-      </w:r>
-      <w:r>
-        <w:rPr>
-          <w:lang w:val="en-US"/>
-        </w:rPr>
-        <w:t>Installers</w:t>
-      </w:r>
-      <w:r>
-        <w:t>”</w:t>
-      </w:r>
-      <w:r>
-        <w:t xml:space="preserve"> файл </w:t>
-      </w:r>
-      <w:r>
-        <w:t>“</w:t>
-      </w:r>
-      <w:r>
-        <w:rPr>
-          <w:lang w:val="en-US"/>
-        </w:rPr>
-        <w:t>NET</w:t>
-      </w:r>
-      <w:r>
-        <w:t xml:space="preserve"> </w:t>
-      </w:r>
-      <w:r>
-        <w:rPr>
-          <w:lang w:val="en-US"/>
-        </w:rPr>
-        <w:t>Framework</w:t>
-      </w:r>
-      <w:r>
-        <w:t xml:space="preserve"> 4 </w:t>
-      </w:r>
-      <w:r>
-        <w:rPr>
-          <w:lang w:val="en-US"/>
-        </w:rPr>
-        <w:t>Installer</w:t>
-      </w:r>
-      <w:r>
-        <w:t>.</w:t>
-      </w:r>
-      <w:r>
-        <w:rPr>
-          <w:lang w:val="en-US"/>
-        </w:rPr>
-        <w:t>exe</w:t>
-      </w:r>
-      <w:r>
-        <w:t>”</w:t>
-      </w:r>
-      <w:r>
-        <w:t xml:space="preserve">, тем самым установив </w:t>
-      </w:r>
-      <w:r>
-        <w:t>“.</w:t>
-      </w:r>
-      <w:r>
-        <w:rPr>
-          <w:lang w:val="en-US"/>
-        </w:rPr>
-        <w:t>NET</w:t>
-      </w:r>
-      <w:r>
-        <w:t xml:space="preserve"> </w:t>
-      </w:r>
-      <w:r>
-        <w:rPr>
-          <w:lang w:val="en-US"/>
-        </w:rPr>
-        <w:t>Framework</w:t>
-      </w:r>
-      <w:r>
-        <w:t xml:space="preserve"> 4</w:t>
-      </w:r>
-      <w:r>
-        <w:t>®</w:t>
-      </w:r>
-      <w:r>
-        <w:t>” (</w:t>
-      </w:r>
-      <w:r>
-        <w:rPr>
-          <w:lang w:val="en-US"/>
-        </w:rPr>
-        <w:t>Microsoft</w:t>
-      </w:r>
-      <w:r>
-        <w:t>©</w:t>
-      </w:r>
-      <w:r>
-        <w:t xml:space="preserve"> </w:t>
-      </w:r>
-      <w:r>
         <w:rPr>
           <w:lang w:val="en-US"/>
         </w:rPr>
@@ -4454,7 +4168,7 @@
         <w:t>.)</w:t>
       </w:r>
       <w:r>
-        <w:t xml:space="preserve">. После чего попробуйте запустить программу снова. </w:t>
+        <w:t xml:space="preserve"> и попробуйте запустить программу снова. </w:t>
       </w:r>
       <w:r>
         <w:rPr>

</xml_diff>